<commit_message>
Reflect latest UI in docs, fix hotkey notation, switch Quick Start to PDF
Updates the User Manual and Quick Start guide to match the current app:
corrected snippet-editor entry points, Clear History's move to Preferences,
the new Help tab, and launch-at-login's new default. Hotkey symbols now
match their spelled-out modifier names (Shift-Command-V, etc.), and the
Quick Start's snippet-creation walkthrough is simplified to one path.

The Quick Start guide is now distributed as a PDF instead of a Word doc,
rendered from Markdown via headless Chrome (Manuals/generate_pdf.js) to
keep the same brand-purple table styling as the User Manual.

Co-Authored-By: Claude Sonnet 4.6 <noreply@anthropic.com>
</commit_message>
<xml_diff>
--- a/Manuals/Modern Clipboard User Manual v1.0.0.docx
+++ b/Manuals/Modern Clipboard User Manual v1.0.0.docx
@@ -491,10 +491,10 @@
           <w:b/>
           <w:bCs/>
         </w:rPr>
-        <w:t xml:space="preserve">To launch at login:</w:t>
-      </w:r>
-      <w:r>
-        <w:t xml:space="preserve"> Enable </w:t>
+        <w:t xml:space="preserve">Launch at login:</w:t>
+      </w:r>
+      <w:r>
+        <w:t xml:space="preserve"> Enabled by default on new installs. To turn it off, disable </w:t>
       </w:r>
       <w:r>
         <w:rPr>
@@ -531,7 +531,7 @@
         <w:t xml:space="preserve">Accessibility permission</w:t>
       </w:r>
       <w:r>
-        <w:t xml:space="preserve"> to simulate the paste keystroke (⌘V) on your behalf. Without it, you can browse history but pasting will not work.</w:t>
+        <w:t xml:space="preserve"> to simulate the paste keystroke (⌘V, i.e. Command-V) on your behalf. Without it, you can browse history but pasting will not work.</w:t>
       </w:r>
     </w:p>
     <w:p>
@@ -624,7 +624,7 @@
         <w:t xml:space="preserve">Preferences</w:t>
       </w:r>
       <w:r>
-        <w:t xml:space="preserve"> (⌘, from the menu bar), go to the </w:t>
+        <w:t xml:space="preserve"> (⌘, — Command-Comma — from the menu bar), go to the </w:t>
       </w:r>
       <w:r>
         <w:rPr>
@@ -966,7 +966,7 @@
           <w:sz w:val="18"/>
           <w:szCs w:val="18"/>
         </w:rPr>
-        <w:t xml:space="preserve">────────────────────────</w:t>
+        <w:t xml:space="preserve">    [snippet 1]</w:t>
       </w:r>
     </w:p>
     <w:p>
@@ -979,7 +979,7 @@
           <w:sz w:val="18"/>
           <w:szCs w:val="18"/>
         </w:rPr>
-        <w:t xml:space="preserve">  Clear History…</w:t>
+        <w:t xml:space="preserve">    [snippet 2]</w:t>
       </w:r>
     </w:p>
     <w:p>
@@ -992,7 +992,7 @@
           <w:sz w:val="18"/>
           <w:szCs w:val="18"/>
         </w:rPr>
-        <w:t xml:space="preserve">  Edit Snippets…</w:t>
+        <w:t xml:space="preserve">    …</w:t>
       </w:r>
     </w:p>
     <w:p>
@@ -1005,7 +1005,7 @@
           <w:sz w:val="18"/>
           <w:szCs w:val="18"/>
         </w:rPr>
-        <w:t xml:space="preserve">  Check for Updates…</w:t>
+        <w:t xml:space="preserve">    Edit Snippets…</w:t>
       </w:r>
     </w:p>
     <w:p>
@@ -1018,7 +1018,7 @@
           <w:sz w:val="18"/>
           <w:szCs w:val="18"/>
         </w:rPr>
-        <w:t xml:space="preserve">  Preferences…            ⌘,</w:t>
+        <w:t xml:space="preserve">────────────────────────</w:t>
       </w:r>
     </w:p>
     <w:p>
@@ -1031,6 +1031,45 @@
           <w:sz w:val="18"/>
           <w:szCs w:val="18"/>
         </w:rPr>
+        <w:t xml:space="preserve">  Check for Updates…</w:t>
+      </w:r>
+    </w:p>
+    <w:p>
+      <w:pPr>
+        <w:spacing w:after="0"/>
+      </w:pPr>
+      <w:r>
+        <w:rPr>
+          <w:rFonts w:ascii="Menlo" w:cs="Menlo" w:eastAsia="Menlo" w:hAnsi="Menlo"/>
+          <w:sz w:val="18"/>
+          <w:szCs w:val="18"/>
+        </w:rPr>
+        <w:t xml:space="preserve">  Help &amp; Feedback…</w:t>
+      </w:r>
+    </w:p>
+    <w:p>
+      <w:pPr>
+        <w:spacing w:after="0"/>
+      </w:pPr>
+      <w:r>
+        <w:rPr>
+          <w:rFonts w:ascii="Menlo" w:cs="Menlo" w:eastAsia="Menlo" w:hAnsi="Menlo"/>
+          <w:sz w:val="18"/>
+          <w:szCs w:val="18"/>
+        </w:rPr>
+        <w:t xml:space="preserve">  Preferences…            ⌘,</w:t>
+      </w:r>
+    </w:p>
+    <w:p>
+      <w:pPr>
+        <w:spacing w:after="0"/>
+      </w:pPr>
+      <w:r>
+        <w:rPr>
+          <w:rFonts w:ascii="Menlo" w:cs="Menlo" w:eastAsia="Menlo" w:hAnsi="Menlo"/>
+          <w:sz w:val="18"/>
+          <w:szCs w:val="18"/>
+        </w:rPr>
         <w:t xml:space="preserve">  Quit Modern Clipboard    ⌘Q</w:t>
       </w:r>
     </w:p>
@@ -1038,6 +1077,14 @@
       <w:pPr>
         <w:spacing w:after="120"/>
       </w:pPr>
+    </w:p>
+    <w:p>
+      <w:pPr>
+        <w:spacing w:after="120"/>
+      </w:pPr>
+      <w:r>
+        <w:t xml:space="preserve">(⌘1, ⌘2, … = Command-1, Command-2; ⌘, = Command-Comma; ⌘Q = Command-Q)</w:t>
+      </w:r>
     </w:p>
     <w:p>
       <w:pPr>
@@ -1050,7 +1097,7 @@
         <w:ind w:left="504"/>
       </w:pPr>
       <w:r>
-        <w:t xml:space="preserve">Items 1–9 have keyboard shortcuts (⌘1 through ⌘9) when the menu is open.</w:t>
+        <w:t xml:space="preserve">Items 1–9 have keyboard shortcuts (⌘1 through ⌘9, i.e. Command-1 through Command-9) when the menu is open.</w:t>
       </w:r>
     </w:p>
     <w:p>
@@ -1078,14 +1125,62 @@
         <w:ind w:left="504"/>
       </w:pPr>
       <w:r>
-        <w:rPr>
-          <w:b/>
-          <w:bCs/>
-        </w:rPr>
-        <w:t xml:space="preserve">Clear History…</w:t>
-      </w:r>
-      <w:r>
-        <w:t xml:space="preserve"> asks for confirmation before deleting all items.</w:t>
+        <w:t xml:space="preserve">Each snippet folder's submenu ends with </w:t>
+      </w:r>
+      <w:r>
+        <w:rPr>
+          <w:b/>
+          <w:bCs/>
+        </w:rPr>
+        <w:t xml:space="preserve">Edit Snippets…</w:t>
+      </w:r>
+      <w:r>
+        <w:t xml:space="preserve">, which opens the snippet editor (see §6).</w:t>
+      </w:r>
+    </w:p>
+    <w:p>
+      <w:pPr>
+        <w:pStyle w:val="ListParagraph"/>
+        <w:numPr>
+          <w:ilvl w:val="0"/>
+          <w:numId w:val="1"/>
+        </w:numPr>
+        <w:spacing w:after="60"/>
+        <w:ind w:left="504"/>
+      </w:pPr>
+      <w:r>
+        <w:rPr>
+          <w:b/>
+          <w:bCs/>
+        </w:rPr>
+        <w:t xml:space="preserve">Help &amp; Feedback…</w:t>
+      </w:r>
+      <w:r>
+        <w:t xml:space="preserve"> opens Preferences with the Help tab selected (see §8).</w:t>
+      </w:r>
+    </w:p>
+    <w:p>
+      <w:pPr>
+        <w:pStyle w:val="ListParagraph"/>
+        <w:numPr>
+          <w:ilvl w:val="0"/>
+          <w:numId w:val="1"/>
+        </w:numPr>
+        <w:spacing w:after="60"/>
+        <w:ind w:left="504"/>
+      </w:pPr>
+      <w:r>
+        <w:t xml:space="preserve">Clearing your clipboard history is done from </w:t>
+      </w:r>
+      <w:r>
+        <w:rPr>
+          <w:b/>
+          <w:bCs/>
+        </w:rPr>
+        <w:t xml:space="preserve">Preferences → General</w:t>
+      </w:r>
+      <w:r>
+        <w:t xml:space="preserve">, not from this menu (see §5 "Clearing History").</w:t>
       </w:r>
     </w:p>
     <w:p>
@@ -1104,7 +1199,7 @@
         <w:t xml:space="preserve">Tip:</w:t>
       </w:r>
       <w:r>
-        <w:t xml:space="preserve"> The popup (⌘⇧V) is faster for navigating large histories — the menu is best for quick one-click access to recent items.</w:t>
+        <w:t xml:space="preserve"> The popup (⇧⌘V, i.e. Shift-Command-V) is faster for navigating large histories — the menu is best for quick one-click access to recent items.</w:t>
       </w:r>
     </w:p>
     <w:p>
@@ -1576,10 +1671,10 @@
           <w:b/>
           <w:bCs/>
         </w:rPr>
-        <w:t xml:space="preserve">⌘⇧V</w:t>
-      </w:r>
-      <w:r>
-        <w:t xml:space="preserve"> (default; customizable) anywhere to open the history popup.</w:t>
+        <w:t xml:space="preserve">⇧⌘V</w:t>
+      </w:r>
+      <w:r>
+        <w:t xml:space="preserve"> (Shift-Command-V; default; customizable) anywhere to open the history popup.</w:t>
       </w:r>
     </w:p>
     <w:p>
@@ -1811,7 +1906,7 @@
               <w:spacing w:after="0"/>
             </w:pPr>
             <w:r>
-              <w:t xml:space="preserve">→ or ⏎</w:t>
+              <w:t xml:space="preserve">→ or ⏎ (Return)</w:t>
             </w:r>
           </w:p>
         </w:tc>
@@ -1917,7 +2012,7 @@
               <w:spacing w:after="0"/>
             </w:pPr>
             <w:r>
-              <w:t xml:space="preserve">Esc</w:t>
+              <w:t xml:space="preserve">Esc (Escape)</w:t>
             </w:r>
           </w:p>
         </w:tc>
@@ -2122,7 +2217,7 @@
               <w:spacing w:after="0"/>
             </w:pPr>
             <w:r>
-              <w:t xml:space="preserve">⏎</w:t>
+              <w:t xml:space="preserve">⏎ (Return)</w:t>
             </w:r>
           </w:p>
         </w:tc>
@@ -2228,7 +2323,7 @@
               <w:spacing w:after="0"/>
             </w:pPr>
             <w:r>
-              <w:t xml:space="preserve">← or Esc</w:t>
+              <w:t xml:space="preserve">← or Esc (Escape)</w:t>
             </w:r>
           </w:p>
         </w:tc>
@@ -2562,7 +2657,7 @@
         <w:t xml:space="preserve">1. </w:t>
       </w:r>
       <w:r>
-        <w:t xml:space="preserve">Select an item and press ⏎ (or click).</w:t>
+        <w:t xml:space="preserve">Select an item and press ⏎ (Return), or click.</w:t>
       </w:r>
     </w:p>
     <w:p>
@@ -2610,7 +2705,7 @@
         <w:t xml:space="preserve">5. </w:t>
       </w:r>
       <w:r>
-        <w:t xml:space="preserve">A ⌘V keystroke is sent to paste it.</w:t>
+        <w:t xml:space="preserve">A ⌘V (Command-V) keystroke is sent to paste it.</w:t>
       </w:r>
     </w:p>
     <w:p>
@@ -2678,7 +2773,7 @@
         <w:t xml:space="preserve">Preferences → Hotkeys</w:t>
       </w:r>
       <w:r>
-        <w:t xml:space="preserve">) while pressing ⏎ or clicking the item. This strips all formatting and pastes plain text only, regardless of the </w:t>
+        <w:t xml:space="preserve">) while pressing ⏎ (Return) or clicking the item. This strips all formatting and pastes plain text only, regardless of the </w:t>
       </w:r>
       <w:r>
         <w:rPr>
@@ -2782,7 +2877,17 @@
         <w:spacing w:after="120"/>
       </w:pPr>
       <w:r>
-        <w:t xml:space="preserve">Click </w:t>
+        <w:t xml:space="preserve">Go to </w:t>
+      </w:r>
+      <w:r>
+        <w:rPr>
+          <w:b/>
+          <w:bCs/>
+        </w:rPr>
+        <w:t xml:space="preserve">Preferences → General → Clipboard History</w:t>
+      </w:r>
+      <w:r>
+        <w:t xml:space="preserve"> and click </w:t>
       </w:r>
       <w:r>
         <w:rPr>
@@ -2792,7 +2897,7 @@
         <w:t xml:space="preserve">Clear History…</w:t>
       </w:r>
       <w:r>
-        <w:t xml:space="preserve"> in the menu bar menu. A confirmation dialog appears before anything is deleted.</w:t>
+        <w:t xml:space="preserve">. A confirmation dialog appears, warning that this permanently deletes all clipboard history and cannot be undone.</w:t>
       </w:r>
     </w:p>
     <w:p>
@@ -2836,7 +2941,7 @@
         <w:t xml:space="preserve">⇧⌘S</w:t>
       </w:r>
       <w:r>
-        <w:t xml:space="preserve"> (default; customizable) anywhere to open the snippets popup.</w:t>
+        <w:t xml:space="preserve"> (Shift-Command-S; default; customizable) anywhere to open the snippets popup.</w:t>
       </w:r>
     </w:p>
     <w:p>
@@ -2886,7 +2991,7 @@
         <w:ind w:left="504"/>
       </w:pPr>
       <w:r>
-        <w:t xml:space="preserve">↓/↑ to move, → or ⏎ to open a folder, ⏎ to paste a snippet, ← or Esc to go back.</w:t>
+        <w:t xml:space="preserve">↓/↑ to move, → or ⏎ (Return) to open a folder, ⏎ (Return) to paste a snippet, ← or Esc (Escape) to go back.</w:t>
       </w:r>
     </w:p>
     <w:p>
@@ -2910,7 +3015,82 @@
           <w:b/>
           <w:bCs/>
         </w:rPr>
-        <w:t xml:space="preserve">menu bar → Edit Snippets…</w:t>
+        <w:t xml:space="preserve">Edit Snippets…</w:t>
+      </w:r>
+      <w:r>
+        <w:t xml:space="preserve">, which appears in any of these places:</w:t>
+      </w:r>
+    </w:p>
+    <w:p>
+      <w:pPr>
+        <w:pStyle w:val="ListParagraph"/>
+        <w:numPr>
+          <w:ilvl w:val="0"/>
+          <w:numId w:val="1"/>
+        </w:numPr>
+        <w:spacing w:after="60"/>
+        <w:ind w:left="504"/>
+      </w:pPr>
+      <w:r>
+        <w:t xml:space="preserve">At the bottom of a folder's items panel in the </w:t>
+      </w:r>
+      <w:r>
+        <w:rPr>
+          <w:b/>
+          <w:bCs/>
+        </w:rPr>
+        <w:t xml:space="preserve">snippets popup</w:t>
+      </w:r>
+      <w:r>
+        <w:t xml:space="preserve"> (⇧⌘S).</w:t>
+      </w:r>
+    </w:p>
+    <w:p>
+      <w:pPr>
+        <w:pStyle w:val="ListParagraph"/>
+        <w:numPr>
+          <w:ilvl w:val="0"/>
+          <w:numId w:val="1"/>
+        </w:numPr>
+        <w:spacing w:after="60"/>
+        <w:ind w:left="504"/>
+      </w:pPr>
+      <w:r>
+        <w:t xml:space="preserve">At the bottom of a snippet folder's items panel in the </w:t>
+      </w:r>
+      <w:r>
+        <w:rPr>
+          <w:b/>
+          <w:bCs/>
+        </w:rPr>
+        <w:t xml:space="preserve">clipboard history popup</w:t>
+      </w:r>
+      <w:r>
+        <w:t xml:space="preserve"> (⇧⌘V).</w:t>
+      </w:r>
+    </w:p>
+    <w:p>
+      <w:pPr>
+        <w:pStyle w:val="ListParagraph"/>
+        <w:numPr>
+          <w:ilvl w:val="0"/>
+          <w:numId w:val="1"/>
+        </w:numPr>
+        <w:spacing w:after="60"/>
+        <w:ind w:left="504"/>
+      </w:pPr>
+      <w:r>
+        <w:t xml:space="preserve">Inside a folder's submenu in the </w:t>
+      </w:r>
+      <w:r>
+        <w:rPr>
+          <w:b/>
+          <w:bCs/>
+        </w:rPr>
+        <w:t xml:space="preserve">menu bar icon's dropdown</w:t>
+      </w:r>
+      <w:r>
+        <w:t xml:space="preserve"> (see §4).</w:t>
       </w:r>
     </w:p>
     <w:p>
@@ -3212,6 +3392,7 @@
       <w:tblGrid>
         <w:gridCol w:w="100"/>
         <w:gridCol w:w="100"/>
+        <w:gridCol w:w="100"/>
       </w:tblGrid>
       <w:tr>
         <w:trPr>
@@ -3267,6 +3448,28 @@
             <w:pPr>
               <w:spacing w:after="0"/>
             </w:pPr>
+          </w:p>
+        </w:tc>
+        <w:tc>
+          <w:tcPr>
+            <w:tcBorders>
+              <w:top w:val="single" w:color="CCCCCC" w:sz="2"/>
+              <w:left w:val="single" w:color="CCCCCC" w:sz="2"/>
+              <w:bottom w:val="single" w:color="CCCCCC" w:sz="2"/>
+              <w:right w:val="single" w:color="CCCCCC" w:sz="2"/>
+            </w:tcBorders>
+            <w:shd w:fill="D9D8FF" w:color="D9D8FF" w:val="solid"/>
+            <w:tcMar>
+              <w:top w:type="dxa" w:w="60"/>
+              <w:left w:type="dxa" w:w="100"/>
+              <w:bottom w:type="dxa" w:w="60"/>
+              <w:right w:type="dxa" w:w="100"/>
+            </w:tcMar>
+          </w:tcPr>
+          <w:p>
+            <w:pPr>
+              <w:spacing w:after="0"/>
+            </w:pPr>
             <w:r>
               <w:rPr>
                 <w:b/>
@@ -3306,7 +3509,31 @@
                 <w:b/>
                 <w:bCs/>
               </w:rPr>
-              <w:t xml:space="preserve">⌘⇧V</w:t>
+              <w:t xml:space="preserve">⇧⌘V</w:t>
+            </w:r>
+          </w:p>
+        </w:tc>
+        <w:tc>
+          <w:tcPr>
+            <w:tcBorders>
+              <w:top w:val="single" w:color="CCCCCC" w:sz="2"/>
+              <w:left w:val="single" w:color="CCCCCC" w:sz="2"/>
+              <w:bottom w:val="single" w:color="CCCCCC" w:sz="2"/>
+              <w:right w:val="single" w:color="CCCCCC" w:sz="2"/>
+            </w:tcBorders>
+            <w:tcMar>
+              <w:top w:type="dxa" w:w="60"/>
+              <w:left w:type="dxa" w:w="100"/>
+              <w:bottom w:type="dxa" w:w="60"/>
+              <w:right w:type="dxa" w:w="100"/>
+            </w:tcMar>
+          </w:tcPr>
+          <w:p>
+            <w:pPr>
+              <w:spacing w:after="0"/>
+            </w:pPr>
+            <w:r>
+              <w:t xml:space="preserve">Shift-Command-V</w:t>
             </w:r>
           </w:p>
         </w:tc>
@@ -3364,6 +3591,30 @@
                 <w:bCs/>
               </w:rPr>
               <w:t xml:space="preserve">⇧⌘S</w:t>
+            </w:r>
+          </w:p>
+        </w:tc>
+        <w:tc>
+          <w:tcPr>
+            <w:tcBorders>
+              <w:top w:val="single" w:color="CCCCCC" w:sz="2"/>
+              <w:left w:val="single" w:color="CCCCCC" w:sz="2"/>
+              <w:bottom w:val="single" w:color="CCCCCC" w:sz="2"/>
+              <w:right w:val="single" w:color="CCCCCC" w:sz="2"/>
+            </w:tcBorders>
+            <w:tcMar>
+              <w:top w:type="dxa" w:w="60"/>
+              <w:left w:type="dxa" w:w="100"/>
+              <w:bottom w:type="dxa" w:w="60"/>
+              <w:right w:type="dxa" w:w="100"/>
+            </w:tcMar>
+          </w:tcPr>
+          <w:p>
+            <w:pPr>
+              <w:spacing w:after="0"/>
+            </w:pPr>
+            <w:r>
+              <w:t xml:space="preserve">Shift-Command-S</w:t>
             </w:r>
           </w:p>
         </w:tc>
@@ -3440,6 +3691,7 @@
       <w:tblGrid>
         <w:gridCol w:w="100"/>
         <w:gridCol w:w="100"/>
+        <w:gridCol w:w="100"/>
       </w:tblGrid>
       <w:tr>
         <w:trPr>
@@ -3495,6 +3747,28 @@
             <w:pPr>
               <w:spacing w:after="0"/>
             </w:pPr>
+          </w:p>
+        </w:tc>
+        <w:tc>
+          <w:tcPr>
+            <w:tcBorders>
+              <w:top w:val="single" w:color="CCCCCC" w:sz="2"/>
+              <w:left w:val="single" w:color="CCCCCC" w:sz="2"/>
+              <w:bottom w:val="single" w:color="CCCCCC" w:sz="2"/>
+              <w:right w:val="single" w:color="CCCCCC" w:sz="2"/>
+            </w:tcBorders>
+            <w:shd w:fill="D9D8FF" w:color="D9D8FF" w:val="solid"/>
+            <w:tcMar>
+              <w:top w:type="dxa" w:w="60"/>
+              <w:left w:type="dxa" w:w="100"/>
+              <w:bottom w:type="dxa" w:w="60"/>
+              <w:right w:type="dxa" w:w="100"/>
+            </w:tcMar>
+          </w:tcPr>
+          <w:p>
+            <w:pPr>
+              <w:spacing w:after="0"/>
+            </w:pPr>
             <w:r>
               <w:rPr>
                 <w:b/>
@@ -3554,6 +3828,30 @@
               <w:spacing w:after="0"/>
             </w:pPr>
             <w:r>
+              <w:t xml:space="preserve">Down Arrow / Up Arrow</w:t>
+            </w:r>
+          </w:p>
+        </w:tc>
+        <w:tc>
+          <w:tcPr>
+            <w:tcBorders>
+              <w:top w:val="single" w:color="CCCCCC" w:sz="2"/>
+              <w:left w:val="single" w:color="CCCCCC" w:sz="2"/>
+              <w:bottom w:val="single" w:color="CCCCCC" w:sz="2"/>
+              <w:right w:val="single" w:color="CCCCCC" w:sz="2"/>
+            </w:tcBorders>
+            <w:tcMar>
+              <w:top w:type="dxa" w:w="60"/>
+              <w:left w:type="dxa" w:w="100"/>
+              <w:bottom w:type="dxa" w:w="60"/>
+              <w:right w:type="dxa" w:w="100"/>
+            </w:tcMar>
+          </w:tcPr>
+          <w:p>
+            <w:pPr>
+              <w:spacing w:after="0"/>
+            </w:pPr>
+            <w:r>
               <w:t xml:space="preserve">Navigate items or groups</w:t>
             </w:r>
           </w:p>
@@ -3607,6 +3905,30 @@
               <w:spacing w:after="0"/>
             </w:pPr>
             <w:r>
+              <w:t xml:space="preserve">Right Arrow</w:t>
+            </w:r>
+          </w:p>
+        </w:tc>
+        <w:tc>
+          <w:tcPr>
+            <w:tcBorders>
+              <w:top w:val="single" w:color="CCCCCC" w:sz="2"/>
+              <w:left w:val="single" w:color="CCCCCC" w:sz="2"/>
+              <w:bottom w:val="single" w:color="CCCCCC" w:sz="2"/>
+              <w:right w:val="single" w:color="CCCCCC" w:sz="2"/>
+            </w:tcBorders>
+            <w:tcMar>
+              <w:top w:type="dxa" w:w="60"/>
+              <w:left w:type="dxa" w:w="100"/>
+              <w:bottom w:type="dxa" w:w="60"/>
+              <w:right w:type="dxa" w:w="100"/>
+            </w:tcMar>
+          </w:tcPr>
+          <w:p>
+            <w:pPr>
+              <w:spacing w:after="0"/>
+            </w:pPr>
+            <w:r>
               <w:t xml:space="preserve">Open selected group / enter item panel</w:t>
             </w:r>
           </w:p>
@@ -3660,6 +3982,30 @@
               <w:spacing w:after="0"/>
             </w:pPr>
             <w:r>
+              <w:t xml:space="preserve">Left Arrow</w:t>
+            </w:r>
+          </w:p>
+        </w:tc>
+        <w:tc>
+          <w:tcPr>
+            <w:tcBorders>
+              <w:top w:val="single" w:color="CCCCCC" w:sz="2"/>
+              <w:left w:val="single" w:color="CCCCCC" w:sz="2"/>
+              <w:bottom w:val="single" w:color="CCCCCC" w:sz="2"/>
+              <w:right w:val="single" w:color="CCCCCC" w:sz="2"/>
+            </w:tcBorders>
+            <w:tcMar>
+              <w:top w:type="dxa" w:w="60"/>
+              <w:left w:type="dxa" w:w="100"/>
+              <w:bottom w:type="dxa" w:w="60"/>
+              <w:right w:type="dxa" w:w="100"/>
+            </w:tcMar>
+          </w:tcPr>
+          <w:p>
+            <w:pPr>
+              <w:spacing w:after="0"/>
+            </w:pPr>
+            <w:r>
               <w:t xml:space="preserve">Return to group list</w:t>
             </w:r>
           </w:p>
@@ -3713,6 +4059,30 @@
               <w:spacing w:after="0"/>
             </w:pPr>
             <w:r>
+              <w:t xml:space="preserve">Return</w:t>
+            </w:r>
+          </w:p>
+        </w:tc>
+        <w:tc>
+          <w:tcPr>
+            <w:tcBorders>
+              <w:top w:val="single" w:color="CCCCCC" w:sz="2"/>
+              <w:left w:val="single" w:color="CCCCCC" w:sz="2"/>
+              <w:bottom w:val="single" w:color="CCCCCC" w:sz="2"/>
+              <w:right w:val="single" w:color="CCCCCC" w:sz="2"/>
+            </w:tcBorders>
+            <w:tcMar>
+              <w:top w:type="dxa" w:w="60"/>
+              <w:left w:type="dxa" w:w="100"/>
+              <w:bottom w:type="dxa" w:w="60"/>
+              <w:right w:type="dxa" w:w="100"/>
+            </w:tcMar>
+          </w:tcPr>
+          <w:p>
+            <w:pPr>
+              <w:spacing w:after="0"/>
+            </w:pPr>
+            <w:r>
               <w:t xml:space="preserve">Paste selected item / open group</w:t>
             </w:r>
           </w:p>
@@ -3766,6 +4136,30 @@
               <w:spacing w:after="0"/>
             </w:pPr>
             <w:r>
+              <w:t xml:space="preserve">—</w:t>
+            </w:r>
+          </w:p>
+        </w:tc>
+        <w:tc>
+          <w:tcPr>
+            <w:tcBorders>
+              <w:top w:val="single" w:color="CCCCCC" w:sz="2"/>
+              <w:left w:val="single" w:color="CCCCCC" w:sz="2"/>
+              <w:bottom w:val="single" w:color="CCCCCC" w:sz="2"/>
+              <w:right w:val="single" w:color="CCCCCC" w:sz="2"/>
+            </w:tcBorders>
+            <w:tcMar>
+              <w:top w:type="dxa" w:w="60"/>
+              <w:left w:type="dxa" w:w="100"/>
+              <w:bottom w:type="dxa" w:w="60"/>
+              <w:right w:type="dxa" w:w="100"/>
+            </w:tcMar>
+          </w:tcPr>
+          <w:p>
+            <w:pPr>
+              <w:spacing w:after="0"/>
+            </w:pPr>
+            <w:r>
               <w:t xml:space="preserve">Jump to or paste item at that number</w:t>
             </w:r>
           </w:p>
@@ -3796,6 +4190,30 @@
             </w:pPr>
             <w:r>
               <w:t xml:space="preserve">Esc</w:t>
+            </w:r>
+          </w:p>
+        </w:tc>
+        <w:tc>
+          <w:tcPr>
+            <w:tcBorders>
+              <w:top w:val="single" w:color="CCCCCC" w:sz="2"/>
+              <w:left w:val="single" w:color="CCCCCC" w:sz="2"/>
+              <w:bottom w:val="single" w:color="CCCCCC" w:sz="2"/>
+              <w:right w:val="single" w:color="CCCCCC" w:sz="2"/>
+            </w:tcBorders>
+            <w:tcMar>
+              <w:top w:type="dxa" w:w="60"/>
+              <w:left w:type="dxa" w:w="100"/>
+              <w:bottom w:type="dxa" w:w="60"/>
+              <w:right w:type="dxa" w:w="100"/>
+            </w:tcMar>
+          </w:tcPr>
+          <w:p>
+            <w:pPr>
+              <w:spacing w:after="0"/>
+            </w:pPr>
+            <w:r>
+              <w:t xml:space="preserve">Escape</w:t>
             </w:r>
           </w:p>
         </w:tc>
@@ -3854,6 +4272,7 @@
       <w:tblGrid>
         <w:gridCol w:w="100"/>
         <w:gridCol w:w="100"/>
+        <w:gridCol w:w="100"/>
       </w:tblGrid>
       <w:tr>
         <w:trPr>
@@ -3909,6 +4328,28 @@
             <w:pPr>
               <w:spacing w:after="0"/>
             </w:pPr>
+          </w:p>
+        </w:tc>
+        <w:tc>
+          <w:tcPr>
+            <w:tcBorders>
+              <w:top w:val="single" w:color="CCCCCC" w:sz="2"/>
+              <w:left w:val="single" w:color="CCCCCC" w:sz="2"/>
+              <w:bottom w:val="single" w:color="CCCCCC" w:sz="2"/>
+              <w:right w:val="single" w:color="CCCCCC" w:sz="2"/>
+            </w:tcBorders>
+            <w:shd w:fill="D9D8FF" w:color="D9D8FF" w:val="solid"/>
+            <w:tcMar>
+              <w:top w:type="dxa" w:w="60"/>
+              <w:left w:type="dxa" w:w="100"/>
+              <w:bottom w:type="dxa" w:w="60"/>
+              <w:right w:type="dxa" w:w="100"/>
+            </w:tcMar>
+          </w:tcPr>
+          <w:p>
+            <w:pPr>
+              <w:spacing w:after="0"/>
+            </w:pPr>
             <w:r>
               <w:rPr>
                 <w:b/>
@@ -3968,6 +4409,30 @@
               <w:spacing w:after="0"/>
             </w:pPr>
             <w:r>
+              <w:t xml:space="preserve">Command-Comma</w:t>
+            </w:r>
+          </w:p>
+        </w:tc>
+        <w:tc>
+          <w:tcPr>
+            <w:tcBorders>
+              <w:top w:val="single" w:color="CCCCCC" w:sz="2"/>
+              <w:left w:val="single" w:color="CCCCCC" w:sz="2"/>
+              <w:bottom w:val="single" w:color="CCCCCC" w:sz="2"/>
+              <w:right w:val="single" w:color="CCCCCC" w:sz="2"/>
+            </w:tcBorders>
+            <w:tcMar>
+              <w:top w:type="dxa" w:w="60"/>
+              <w:left w:type="dxa" w:w="100"/>
+              <w:bottom w:type="dxa" w:w="60"/>
+              <w:right w:type="dxa" w:w="100"/>
+            </w:tcMar>
+          </w:tcPr>
+          <w:p>
+            <w:pPr>
+              <w:spacing w:after="0"/>
+            </w:pPr>
+            <w:r>
               <w:t xml:space="preserve">Open Preferences</w:t>
             </w:r>
           </w:p>
@@ -4021,6 +4486,30 @@
               <w:spacing w:after="0"/>
             </w:pPr>
             <w:r>
+              <w:t xml:space="preserve">Command-Q</w:t>
+            </w:r>
+          </w:p>
+        </w:tc>
+        <w:tc>
+          <w:tcPr>
+            <w:tcBorders>
+              <w:top w:val="single" w:color="CCCCCC" w:sz="2"/>
+              <w:left w:val="single" w:color="CCCCCC" w:sz="2"/>
+              <w:bottom w:val="single" w:color="CCCCCC" w:sz="2"/>
+              <w:right w:val="single" w:color="CCCCCC" w:sz="2"/>
+            </w:tcBorders>
+            <w:tcMar>
+              <w:top w:type="dxa" w:w="60"/>
+              <w:left w:type="dxa" w:w="100"/>
+              <w:bottom w:type="dxa" w:w="60"/>
+              <w:right w:type="dxa" w:w="100"/>
+            </w:tcMar>
+          </w:tcPr>
+          <w:p>
+            <w:pPr>
+              <w:spacing w:after="0"/>
+            </w:pPr>
+            <w:r>
               <w:t xml:space="preserve">Quit Modern Clipboard</w:t>
             </w:r>
           </w:p>
@@ -4074,6 +4563,30 @@
               <w:spacing w:after="0"/>
             </w:pPr>
             <w:r>
+              <w:t xml:space="preserve">Command-1 through Command-9</w:t>
+            </w:r>
+          </w:p>
+        </w:tc>
+        <w:tc>
+          <w:tcPr>
+            <w:tcBorders>
+              <w:top w:val="single" w:color="CCCCCC" w:sz="2"/>
+              <w:left w:val="single" w:color="CCCCCC" w:sz="2"/>
+              <w:bottom w:val="single" w:color="CCCCCC" w:sz="2"/>
+              <w:right w:val="single" w:color="CCCCCC" w:sz="2"/>
+            </w:tcBorders>
+            <w:tcMar>
+              <w:top w:type="dxa" w:w="60"/>
+              <w:left w:type="dxa" w:w="100"/>
+              <w:bottom w:type="dxa" w:w="60"/>
+              <w:right w:type="dxa" w:w="100"/>
+            </w:tcMar>
+          </w:tcPr>
+          <w:p>
+            <w:pPr>
+              <w:spacing w:after="0"/>
+            </w:pPr>
+            <w:r>
               <w:t xml:space="preserve">Paste history item 1–9 (when menu is open)</w:t>
             </w:r>
           </w:p>
@@ -4137,7 +4650,7 @@
         <w:t xml:space="preserve">3. </w:t>
       </w:r>
       <w:r>
-        <w:t xml:space="preserve">Press your desired key combination (must include at least one modifier: ⌘, ⌥, ⇧, or ⌃).</w:t>
+        <w:t xml:space="preserve">Press your desired key combination (must include at least one modifier: ⌘ Command, ⌥ Option, ⇧ Shift, or ⌃ Control).</w:t>
       </w:r>
     </w:p>
     <w:p>
@@ -4183,7 +4696,7 @@
         <w:ind w:left="576"/>
       </w:pPr>
       <w:r>
-        <w:t xml:space="preserve">Press Esc while recording to cancel without changing the hotkey.</w:t>
+        <w:t xml:space="preserve">Press Esc (Escape) while recording to cancel without changing the hotkey.</w:t>
       </w:r>
     </w:p>
     <w:p>
@@ -4200,7 +4713,7 @@
         <w:spacing w:after="120"/>
       </w:pPr>
       <w:r>
-        <w:t xml:space="preserve">Open Preferences with ⌘, or via the menu bar menu.</w:t>
+        <w:t xml:space="preserve">Open Preferences with ⌘, (Command-Comma) or via the menu bar menu.</w:t>
       </w:r>
     </w:p>
     <w:p>
@@ -5024,7 +5537,7 @@
         <w:t xml:space="preserve">Launch Modern Clipboard at login</w:t>
       </w:r>
       <w:r>
-        <w:t xml:space="preserve"> — registers the app with macOS Login Items so it starts automatically when you log in.</w:t>
+        <w:t xml:space="preserve"> — registers the app with macOS Login Items so it starts automatically when you log in. Enabled by default on new installs.</w:t>
       </w:r>
     </w:p>
     <w:p>
@@ -5051,7 +5564,7 @@
         <w:t xml:space="preserve">Restore Default</w:t>
       </w:r>
       <w:r>
-        <w:t xml:space="preserve"> to go back to ⌘⇧V or ⇧⌘S.</w:t>
+        <w:t xml:space="preserve"> to go back to ⇧⌘V (Shift-Command-V) or ⇧⌘S (Shift-Command-S).</w:t>
       </w:r>
     </w:p>
     <w:p>
@@ -5397,15 +5910,15 @@
         <w:spacing w:after="120" w:before="240"/>
       </w:pPr>
       <w:r>
-        <w:t xml:space="preserve">About Tab</w:t>
-      </w:r>
-    </w:p>
-    <w:p>
-      <w:pPr>
-        <w:spacing w:after="120"/>
-      </w:pPr>
-      <w:r>
-        <w:t xml:space="preserve">Shows app version, developer info, and contact email. Contains:</w:t>
+        <w:t xml:space="preserve">Help Tab</w:t>
+      </w:r>
+    </w:p>
+    <w:p>
+      <w:pPr>
+        <w:spacing w:after="120"/>
+      </w:pPr>
+      <w:r>
+        <w:t xml:space="preserve">Where to go when something goes wrong or you have an idea:</w:t>
       </w:r>
     </w:p>
     <w:p>
@@ -5423,10 +5936,10 @@
           <w:b/>
           <w:bCs/>
         </w:rPr>
-        <w:t xml:space="preserve">Check for Updates…</w:t>
-      </w:r>
-      <w:r>
-        <w:t xml:space="preserve"> — manually trigger an update check</w:t>
+        <w:t xml:space="preserve">Report a Bug…</w:t>
+      </w:r>
+      <w:r>
+        <w:t xml:space="preserve"> — opens a pre-addressed email to report an issue</w:t>
       </w:r>
     </w:p>
     <w:p>
@@ -5444,35 +5957,10 @@
           <w:b/>
           <w:bCs/>
         </w:rPr>
-        <w:t xml:space="preserve">Copyright</w:t>
-      </w:r>
-      <w:r>
-        <w:t xml:space="preserve"> — view the open-source MIT license</w:t>
-      </w:r>
-    </w:p>
-    <w:p>
-      <w:pPr>
-        <w:pStyle w:val="Heading2"/>
-        <w:spacing w:after="120" w:before="240"/>
-      </w:pPr>
-      <w:r>
-        <w:t xml:space="preserve">9. Excluding Apps</w:t>
-      </w:r>
-    </w:p>
-    <w:p>
-      <w:pPr>
-        <w:spacing w:after="120"/>
-      </w:pPr>
-      <w:r>
-        <w:t xml:space="preserve">Clipboard monitoring respects the exclusion list on a per-app basis. When a copied item is detected, Modern Clipboard checks which app is currently frontmost. If that app's bundle ID is in the exclusion list, the item is silently skipped — it never enters history and cannot be pasted from Modern Clipboard.</w:t>
-      </w:r>
-    </w:p>
-    <w:p>
-      <w:pPr>
-        <w:spacing w:after="120"/>
-      </w:pPr>
-      <w:r>
-        <w:t xml:space="preserve">This is most important for:</w:t>
+        <w:t xml:space="preserve">Request a Feature…</w:t>
+      </w:r>
+      <w:r>
+        <w:t xml:space="preserve"> — opens a pre-addressed email to suggest something new</w:t>
       </w:r>
     </w:p>
     <w:p>
@@ -5486,7 +5974,14 @@
         <w:ind w:left="504"/>
       </w:pPr>
       <w:r>
-        <w:t xml:space="preserve">Password managers (auto-fill passwords, credit card numbers)</w:t>
+        <w:rPr>
+          <w:b/>
+          <w:bCs/>
+        </w:rPr>
+        <w:t xml:space="preserve">Export Diagnostics…</w:t>
+      </w:r>
+      <w:r>
+        <w:t xml:space="preserve"> — saves a diagnostics log file (settings snapshot and recent activity) to ~/Downloads; attach this to a bug report to help track down what went wrong</w:t>
       </w:r>
     </w:p>
     <w:p>
@@ -5500,7 +5995,61 @@
         <w:ind w:left="504"/>
       </w:pPr>
       <w:r>
-        <w:t xml:space="preserve">Banking or sensitive form apps</w:t>
+        <w:rPr>
+          <w:b/>
+          <w:bCs/>
+        </w:rPr>
+        <w:t xml:space="preserve">Documentation</w:t>
+      </w:r>
+      <w:r>
+        <w:t xml:space="preserve"> — download buttons for the </w:t>
+      </w:r>
+      <w:r>
+        <w:rPr>
+          <w:b/>
+          <w:bCs/>
+        </w:rPr>
+        <w:t xml:space="preserve">Quick Start Guide</w:t>
+      </w:r>
+      <w:r>
+        <w:t xml:space="preserve"> and </w:t>
+      </w:r>
+      <w:r>
+        <w:rPr>
+          <w:b/>
+          <w:bCs/>
+        </w:rPr>
+        <w:t xml:space="preserve">User Manual</w:t>
+      </w:r>
+      <w:r>
+        <w:t xml:space="preserve"> (</w:t>
+      </w:r>
+      <w:r>
+        <w:rPr>
+          <w:rFonts w:ascii="Menlo" w:cs="Menlo" w:eastAsia="Menlo" w:hAnsi="Menlo"/>
+          <w:color w:val="AD1457"/>
+        </w:rPr>
+        <w:t xml:space="preserve">.docx</w:t>
+      </w:r>
+      <w:r>
+        <w:t xml:space="preserve">), defaulting to ~/Downloads</w:t>
+      </w:r>
+    </w:p>
+    <w:p>
+      <w:pPr>
+        <w:pStyle w:val="Heading3"/>
+        <w:spacing w:after="120" w:before="240"/>
+      </w:pPr>
+      <w:r>
+        <w:t xml:space="preserve">About Tab</w:t>
+      </w:r>
+    </w:p>
+    <w:p>
+      <w:pPr>
+        <w:spacing w:after="120"/>
+      </w:pPr>
+      <w:r>
+        <w:t xml:space="preserve">Shows app version, developer info, and contact email. Contains:</w:t>
       </w:r>
     </w:p>
     <w:p>
@@ -5514,53 +6063,14 @@
         <w:ind w:left="504"/>
       </w:pPr>
       <w:r>
-        <w:t xml:space="preserve">Any app where you frequently copy private data</w:t>
-      </w:r>
-    </w:p>
-    <w:p>
-      <w:pPr>
-        <w:pBdr>
-          <w:left w:val="single" w:color="999999" w:sz="12" w:space="8"/>
-        </w:pBdr>
-        <w:spacing w:after="120"/>
-        <w:ind w:left="576"/>
-      </w:pPr>
-      <w:r>
-        <w:rPr>
-          <w:b/>
-          <w:bCs/>
-        </w:rPr>
-        <w:t xml:space="preserve">How it works technically:</w:t>
-      </w:r>
-      <w:r>
-        <w:t xml:space="preserve"> Modern Clipboard checks the frontmost app's bundle ID at capture time, not at paste time. Exclusion only affects recording; if an item was already in history, it remains there.</w:t>
-      </w:r>
-    </w:p>
-    <w:p>
-      <w:pPr>
-        <w:pStyle w:val="Heading2"/>
-        <w:spacing w:after="120" w:before="240"/>
-      </w:pPr>
-      <w:r>
-        <w:t xml:space="preserve">10. Automatic Updates</w:t>
-      </w:r>
-    </w:p>
-    <w:p>
-      <w:pPr>
-        <w:spacing w:after="120"/>
-      </w:pPr>
-      <w:r>
-        <w:t xml:space="preserve">Modern Clipboard uses the </w:t>
-      </w:r>
-      <w:r>
-        <w:rPr>
-          <w:b/>
-          <w:bCs/>
-        </w:rPr>
-        <w:t xml:space="preserve">Sparkle</w:t>
-      </w:r>
-      <w:r>
-        <w:t xml:space="preserve"> framework for software updates.</w:t>
+        <w:rPr>
+          <w:b/>
+          <w:bCs/>
+        </w:rPr>
+        <w:t xml:space="preserve">Check for Updates…</w:t>
+      </w:r>
+      <w:r>
+        <w:t xml:space="preserve"> — manually trigger an update check</w:t>
       </w:r>
     </w:p>
     <w:p>
@@ -5574,7 +6084,39 @@
         <w:ind w:left="504"/>
       </w:pPr>
       <w:r>
-        <w:t xml:space="preserve">Background checks happen automatically at startup.</w:t>
+        <w:rPr>
+          <w:b/>
+          <w:bCs/>
+        </w:rPr>
+        <w:t xml:space="preserve">Copyright</w:t>
+      </w:r>
+      <w:r>
+        <w:t xml:space="preserve"> — view the open-source MIT license</w:t>
+      </w:r>
+    </w:p>
+    <w:p>
+      <w:pPr>
+        <w:pStyle w:val="Heading2"/>
+        <w:spacing w:after="120" w:before="240"/>
+      </w:pPr>
+      <w:r>
+        <w:t xml:space="preserve">9. Excluding Apps</w:t>
+      </w:r>
+    </w:p>
+    <w:p>
+      <w:pPr>
+        <w:spacing w:after="120"/>
+      </w:pPr>
+      <w:r>
+        <w:t xml:space="preserve">Clipboard monitoring respects the exclusion list on a per-app basis. When a copied item is detected, Modern Clipboard checks which app is currently frontmost. If that app's bundle ID is in the exclusion list, the item is silently skipped — it never enters history and cannot be pasted from Modern Clipboard.</w:t>
+      </w:r>
+    </w:p>
+    <w:p>
+      <w:pPr>
+        <w:spacing w:after="120"/>
+      </w:pPr>
+      <w:r>
+        <w:t xml:space="preserve">This is most important for:</w:t>
       </w:r>
     </w:p>
     <w:p>
@@ -5588,24 +6130,7 @@
         <w:ind w:left="504"/>
       </w:pPr>
       <w:r>
-        <w:t xml:space="preserve">You can trigger a manual check via </w:t>
-      </w:r>
-      <w:r>
-        <w:rPr>
-          <w:b/>
-          <w:bCs/>
-        </w:rPr>
-        <w:t xml:space="preserve">menu bar → Check for Updates…</w:t>
-      </w:r>
-      <w:r>
-        <w:t xml:space="preserve"> or </w:t>
-      </w:r>
-      <w:r>
-        <w:rPr>
-          <w:b/>
-          <w:bCs/>
-        </w:rPr>
-        <w:t xml:space="preserve">Preferences → About → Check for Updates…</w:t>
+        <w:t xml:space="preserve">Password managers (auto-fill passwords, credit card numbers)</w:t>
       </w:r>
     </w:p>
     <w:p>
@@ -5619,7 +6144,40 @@
         <w:ind w:left="504"/>
       </w:pPr>
       <w:r>
-        <w:t xml:space="preserve">When an update is available, a standard Sparkle dialog appears with release notes and an option to install.</w:t>
+        <w:t xml:space="preserve">Banking or sensitive form apps</w:t>
+      </w:r>
+    </w:p>
+    <w:p>
+      <w:pPr>
+        <w:pStyle w:val="ListParagraph"/>
+        <w:numPr>
+          <w:ilvl w:val="0"/>
+          <w:numId w:val="1"/>
+        </w:numPr>
+        <w:spacing w:after="60"/>
+        <w:ind w:left="504"/>
+      </w:pPr>
+      <w:r>
+        <w:t xml:space="preserve">Any app where you frequently copy private data</w:t>
+      </w:r>
+    </w:p>
+    <w:p>
+      <w:pPr>
+        <w:pBdr>
+          <w:left w:val="single" w:color="999999" w:sz="12" w:space="8"/>
+        </w:pBdr>
+        <w:spacing w:after="120"/>
+        <w:ind w:left="576"/>
+      </w:pPr>
+      <w:r>
+        <w:rPr>
+          <w:b/>
+          <w:bCs/>
+        </w:rPr>
+        <w:t xml:space="preserve">How it works technically:</w:t>
+      </w:r>
+      <w:r>
+        <w:t xml:space="preserve"> Modern Clipboard checks the frontmost app's bundle ID at capture time, not at paste time. Exclusion only affects recording; if an item was already in history, it remains there.</w:t>
       </w:r>
     </w:p>
     <w:p>
@@ -5628,6 +6186,92 @@
         <w:spacing w:after="120" w:before="240"/>
       </w:pPr>
       <w:r>
+        <w:t xml:space="preserve">10. Automatic Updates</w:t>
+      </w:r>
+    </w:p>
+    <w:p>
+      <w:pPr>
+        <w:spacing w:after="120"/>
+      </w:pPr>
+      <w:r>
+        <w:t xml:space="preserve">Modern Clipboard uses the </w:t>
+      </w:r>
+      <w:r>
+        <w:rPr>
+          <w:b/>
+          <w:bCs/>
+        </w:rPr>
+        <w:t xml:space="preserve">Sparkle</w:t>
+      </w:r>
+      <w:r>
+        <w:t xml:space="preserve"> framework for software updates.</w:t>
+      </w:r>
+    </w:p>
+    <w:p>
+      <w:pPr>
+        <w:pStyle w:val="ListParagraph"/>
+        <w:numPr>
+          <w:ilvl w:val="0"/>
+          <w:numId w:val="1"/>
+        </w:numPr>
+        <w:spacing w:after="60"/>
+        <w:ind w:left="504"/>
+      </w:pPr>
+      <w:r>
+        <w:t xml:space="preserve">Background checks happen automatically at startup.</w:t>
+      </w:r>
+    </w:p>
+    <w:p>
+      <w:pPr>
+        <w:pStyle w:val="ListParagraph"/>
+        <w:numPr>
+          <w:ilvl w:val="0"/>
+          <w:numId w:val="1"/>
+        </w:numPr>
+        <w:spacing w:after="60"/>
+        <w:ind w:left="504"/>
+      </w:pPr>
+      <w:r>
+        <w:t xml:space="preserve">You can trigger a manual check via </w:t>
+      </w:r>
+      <w:r>
+        <w:rPr>
+          <w:b/>
+          <w:bCs/>
+        </w:rPr>
+        <w:t xml:space="preserve">menu bar → Check for Updates…</w:t>
+      </w:r>
+      <w:r>
+        <w:t xml:space="preserve"> or </w:t>
+      </w:r>
+      <w:r>
+        <w:rPr>
+          <w:b/>
+          <w:bCs/>
+        </w:rPr>
+        <w:t xml:space="preserve">Preferences → About → Check for Updates…</w:t>
+      </w:r>
+    </w:p>
+    <w:p>
+      <w:pPr>
+        <w:pStyle w:val="ListParagraph"/>
+        <w:numPr>
+          <w:ilvl w:val="0"/>
+          <w:numId w:val="1"/>
+        </w:numPr>
+        <w:spacing w:after="60"/>
+        <w:ind w:left="504"/>
+      </w:pPr>
+      <w:r>
+        <w:t xml:space="preserve">When an update is available, a standard Sparkle dialog appears with release notes and an option to install.</w:t>
+      </w:r>
+    </w:p>
+    <w:p>
+      <w:pPr>
+        <w:pStyle w:val="Heading2"/>
+        <w:spacing w:after="120" w:before="240"/>
+      </w:pPr>
+      <w:r>
         <w:t xml:space="preserve">11. Troubleshooting</w:t>
       </w:r>
     </w:p>
@@ -5696,7 +6340,7 @@
         <w:spacing w:after="120" w:before="240"/>
       </w:pPr>
       <w:r>
-        <w:t xml:space="preserve">History popup doesn't open on ⌘⇧V</w:t>
+        <w:t xml:space="preserve">History popup doesn't open on ⇧⌘V (Shift-Command-V)</w:t>
       </w:r>
     </w:p>
     <w:p>
@@ -6020,7 +6664,17 @@
         <w:spacing w:after="120"/>
       </w:pPr>
       <w:r>
-        <w:t xml:space="preserve">Click the menu bar icon, then </w:t>
+        <w:t xml:space="preserve">Go to </w:t>
+      </w:r>
+      <w:r>
+        <w:rPr>
+          <w:b/>
+          <w:bCs/>
+        </w:rPr>
+        <w:t xml:space="preserve">Preferences → General → Clipboard History</w:t>
+      </w:r>
+      <w:r>
+        <w:t xml:space="preserve">, click </w:t>
       </w:r>
       <w:r>
         <w:rPr>
@@ -6030,7 +6684,7 @@
         <w:t xml:space="preserve">Clear History…</w:t>
       </w:r>
       <w:r>
-        <w:t xml:space="preserve"> and confirm. This is permanent and cannot be undone.</w:t>
+        <w:t xml:space="preserve">, and confirm. This is permanent and cannot be undone.</w:t>
       </w:r>
     </w:p>
     <w:p>
@@ -6094,7 +6748,7 @@
       <w:r>
         <w:t xml:space="preserve">Modern Clipboard is based on </w:t>
       </w:r>
-      <w:hyperlink w:history="1" r:id="rIdbendr1_edj98mdob-1ng_">
+      <w:hyperlink w:history="1" r:id="rId0oq4vhfalrqr7um76pmtd">
         <w:r>
           <w:rPr>
             <w:rStyle w:val="Hyperlink"/>

</xml_diff>

<commit_message>
Update docs: formatting is now always captured, not a toggle
Reflects removal of the "Preserve formatting when pasting" preference.
Rich formatting is captured unconditionally on copy; the paste-and-match-
style modifier is now the only way to paste plain text instead.

Co-Authored-By: Claude Sonnet 4.6 <noreply@anthropic.com>
</commit_message>
<xml_diff>
--- a/Manuals/Modern Clipboard User Manual v1.0.0.docx
+++ b/Manuals/Modern Clipboard User Manual v1.0.0.docx
@@ -1637,17 +1637,7 @@
         <w:t xml:space="preserve">Preserving formatting:</w:t>
       </w:r>
       <w:r>
-        <w:t xml:space="preserve"> If </w:t>
-      </w:r>
-      <w:r>
-        <w:rPr>
-          <w:b/>
-          <w:bCs/>
-        </w:rPr>
-        <w:t xml:space="preserve">Preserve formatting when pasting</w:t>
-      </w:r>
-      <w:r>
-        <w:t xml:space="preserve"> is enabled (see §8 Preferences), copied rich text (bold, italics, links, colors, etc. from apps like Word, Pages, Mail, or a web browser) is stored along with its original formatting. When disabled, only plain text is stored and pasted.</w:t>
+        <w:t xml:space="preserve"> Copied rich text (bold, italics, links, colors, etc. from apps like Word, Pages, Mail, or a web browser) is always captured along with its original formatting. By default, pasting an item restores that formatting; to paste plain text instead, use the paste-and-match-style modifier (see "Paste and Match Style" below).</w:t>
       </w:r>
     </w:p>
     <w:p>
@@ -2753,7 +2743,7 @@
         <w:spacing w:after="120"/>
       </w:pPr>
       <w:r>
-        <w:t xml:space="preserve">If an item was stored with formatting (see "Preserving formatting" above), you can still paste it as plain text on demand: hold down the </w:t>
+        <w:t xml:space="preserve">Since formatting is always captured (see "Preserving formatting" above), you can paste any item as plain text on demand instead: hold down the </w:t>
       </w:r>
       <w:r>
         <w:rPr>
@@ -2773,17 +2763,7 @@
         <w:t xml:space="preserve">Preferences → Hotkeys</w:t>
       </w:r>
       <w:r>
-        <w:t xml:space="preserve">) while pressing ⏎ (Return) or clicking the item. This strips all formatting and pastes plain text only, regardless of the </w:t>
-      </w:r>
-      <w:r>
-        <w:rPr>
-          <w:b/>
-          <w:bCs/>
-        </w:rPr>
-        <w:t xml:space="preserve">Preserve formatting when pasting</w:t>
-      </w:r>
-      <w:r>
-        <w:t xml:space="preserve"> setting.</w:t>
+        <w:t xml:space="preserve">) while pressing ⏎ (Return) or clicking the item. This strips all formatting and pastes plain text only.</w:t>
       </w:r>
     </w:p>
     <w:p>
@@ -5409,107 +5389,6 @@
           </w:p>
         </w:tc>
       </w:tr>
-      <w:tr>
-        <w:trPr>
-          <w:tblHeader w:val="false"/>
-        </w:trPr>
-        <w:tc>
-          <w:tcPr>
-            <w:tcBorders>
-              <w:top w:val="single" w:color="CCCCCC" w:sz="2"/>
-              <w:left w:val="single" w:color="CCCCCC" w:sz="2"/>
-              <w:bottom w:val="single" w:color="CCCCCC" w:sz="2"/>
-              <w:right w:val="single" w:color="CCCCCC" w:sz="2"/>
-            </w:tcBorders>
-            <w:tcMar>
-              <w:top w:type="dxa" w:w="60"/>
-              <w:left w:type="dxa" w:w="100"/>
-              <w:bottom w:type="dxa" w:w="60"/>
-              <w:right w:type="dxa" w:w="100"/>
-            </w:tcMar>
-          </w:tcPr>
-          <w:p>
-            <w:pPr>
-              <w:spacing w:after="0"/>
-            </w:pPr>
-            <w:r>
-              <w:t xml:space="preserve">Preserve formatting when pasting</w:t>
-            </w:r>
-          </w:p>
-        </w:tc>
-        <w:tc>
-          <w:tcPr>
-            <w:tcBorders>
-              <w:top w:val="single" w:color="CCCCCC" w:sz="2"/>
-              <w:left w:val="single" w:color="CCCCCC" w:sz="2"/>
-              <w:bottom w:val="single" w:color="CCCCCC" w:sz="2"/>
-              <w:right w:val="single" w:color="CCCCCC" w:sz="2"/>
-            </w:tcBorders>
-            <w:tcMar>
-              <w:top w:type="dxa" w:w="60"/>
-              <w:left w:type="dxa" w:w="100"/>
-              <w:bottom w:type="dxa" w:w="60"/>
-              <w:right w:type="dxa" w:w="100"/>
-            </w:tcMar>
-          </w:tcPr>
-          <w:p>
-            <w:pPr>
-              <w:spacing w:after="0"/>
-            </w:pPr>
-            <w:r>
-              <w:t xml:space="preserve">On / Off</w:t>
-            </w:r>
-          </w:p>
-        </w:tc>
-        <w:tc>
-          <w:tcPr>
-            <w:tcBorders>
-              <w:top w:val="single" w:color="CCCCCC" w:sz="2"/>
-              <w:left w:val="single" w:color="CCCCCC" w:sz="2"/>
-              <w:bottom w:val="single" w:color="CCCCCC" w:sz="2"/>
-              <w:right w:val="single" w:color="CCCCCC" w:sz="2"/>
-            </w:tcBorders>
-            <w:tcMar>
-              <w:top w:type="dxa" w:w="60"/>
-              <w:left w:type="dxa" w:w="100"/>
-              <w:bottom w:type="dxa" w:w="60"/>
-              <w:right w:type="dxa" w:w="100"/>
-            </w:tcMar>
-          </w:tcPr>
-          <w:p>
-            <w:pPr>
-              <w:spacing w:after="0"/>
-            </w:pPr>
-            <w:r>
-              <w:t xml:space="preserve">Off</w:t>
-            </w:r>
-          </w:p>
-        </w:tc>
-        <w:tc>
-          <w:tcPr>
-            <w:tcBorders>
-              <w:top w:val="single" w:color="CCCCCC" w:sz="2"/>
-              <w:left w:val="single" w:color="CCCCCC" w:sz="2"/>
-              <w:bottom w:val="single" w:color="CCCCCC" w:sz="2"/>
-              <w:right w:val="single" w:color="CCCCCC" w:sz="2"/>
-            </w:tcBorders>
-            <w:tcMar>
-              <w:top w:type="dxa" w:w="60"/>
-              <w:left w:type="dxa" w:w="100"/>
-              <w:bottom w:type="dxa" w:w="60"/>
-              <w:right w:type="dxa" w:w="100"/>
-            </w:tcMar>
-          </w:tcPr>
-          <w:p>
-            <w:pPr>
-              <w:spacing w:after="0"/>
-            </w:pPr>
-            <w:r>
-              <w:t xml:space="preserve">When on, copied text keeps its original formatting (bold, links, colors, etc.) when pasted. When off, everything is pasted as plain text.</w:t>
-            </w:r>
-          </w:p>
-        </w:tc>
-      </w:tr>
     </w:tbl>
     <w:p>
       <w:pPr>
@@ -5579,17 +5458,7 @@
         <w:t xml:space="preserve">Paste and match style modifier</w:t>
       </w:r>
       <w:r>
-        <w:t xml:space="preserve"> — choose which modifier key (⌥ Option, ⌃ Control, ⇧ Shift, or ⌘ Command) temporarily forces plain-text pasting from the history popup, overriding </w:t>
-      </w:r>
-      <w:r>
-        <w:rPr>
-          <w:b/>
-          <w:bCs/>
-        </w:rPr>
-        <w:t xml:space="preserve">Preserve formatting when pasting</w:t>
-      </w:r>
-      <w:r>
-        <w:t xml:space="preserve"> for that one paste. Default is ⌥ Option. See §5 "Paste and Match Style."</w:t>
+        <w:t xml:space="preserve"> — choose which modifier key (⌥ Option, ⌃ Control, ⇧ Shift, or ⌘ Command) forces plain-text pasting from the history popup for that one paste, instead of the formatted version. Default is ⌥ Option. See §5 "Paste and Match Style."</w:t>
       </w:r>
     </w:p>
     <w:p>
@@ -6748,7 +6617,7 @@
       <w:r>
         <w:t xml:space="preserve">Modern Clipboard is based on </w:t>
       </w:r>
-      <w:hyperlink w:history="1" r:id="rId0oq4vhfalrqr7um76pmtd">
+      <w:hyperlink w:history="1" r:id="rIdfdj3mmemtagcyk3ouuynp">
         <w:r>
           <w:rPr>
             <w:rStyle w:val="Hyperlink"/>

</xml_diff>